<commit_message>
Add map layers and aviation charts section to article
Co-authored-by: Copilot <223556219+Copilot@users.noreply.github.com>
</commit_message>
<xml_diff>
--- a/docs/flymoon-article.docx
+++ b/docs/flymoon-article.docx
@@ -314,6 +314,22 @@
       <w:r>
         <w:lastRenderedPageBreak/>
         <w:t>A countdown banner at the top of the page — red for high probability, amber for medium — ticks down to the moment of transit in real time.</w:t>
+      </w:r>
+    </w:p>
+    <w:p>
+      <w:pPr>
+        <w:pStyle w:val="BodyText"/>
+      </w:pPr>
+      <w:r>
+        <w:t>Flymoon offers three base map layers, switchable at any time from a control in the top-right corner of the map. The default Street view uses OpenStreetMap — a detailed road map useful for identifying airports and landmarks beneath a flight path. Satellite mode switches to Esri World Imagery, providing photographic ground detail that helps confirm terrain and urban geography. Dark mode renders in CartoDB's Dark Matter tileset, a low-glare option well suited to night observing sessions when screen brightness matters. The selected layer is remembered between visits.</w:t>
+      </w:r>
+    </w:p>
+    <w:p>
+      <w:pPr>
+        <w:pStyle w:val="BodyText"/>
+      </w:pPr>
+      <w:r>
+        <w:t>For observers who think in airways rather than streets, a SkyVector button opens any of three professional aeronautical charts centered on the current map view: World Lo (IFR Low Altitude Enroute), World Hi (IFR High Altitude Enroute), and World VFR. These are the same charts used by commercial pilots for flight planning — overlaying a predicted transit against a high-altitude enroute chart instantly reveals which jet corridors pass closest to your target. For richer in-app context, users with a free OpenAIP account can enable an aviation data overlay directly on the Flymoon map, drawing airspace class boundaries, VOR stations, and airports on top of any base layer.</w:t>
       </w:r>
     </w:p>
     <w:p>

</xml_diff>